<commit_message>
docs: add AI manager outcomes recommendation packet
</commit_message>
<xml_diff>
--- a/output/internal-pilot-packet-2026-05-28/FluencyTracr_Internal_Pilot_Report.docx
+++ b/output/internal-pilot-packet-2026-05-28/FluencyTracr_Internal_Pilot_Report.docx
@@ -66,7 +66,7 @@
           <w:rFonts w:ascii="Arial" w:hAnsi="Arial"/>
           <w:color w:val="061A44"/>
         </w:rPr>
-        <w:t>Executive Readout</w:t>
+        <w:t>Executive Summary</w:t>
       </w:r>
     </w:p>
     <w:p>
@@ -78,7 +78,7 @@
           <w:rFonts w:ascii="Arial" w:hAnsi="Arial"/>
           <w:sz w:val="21"/>
         </w:rPr>
-        <w:t>FluencyTracr can already produce a meaningful aggregate AI work evidence package from observed telemetry. The strongest current value is not ROI calculation; it is separating activity volume from workflow evidence, trust evidence, source coverage, and value-investigation readiness.</w:t>
+        <w:t>FluencyTracr can already produce a meaningful aggregate AI work evidence package from observed telemetry. The strongest current value is not ROI calculation; it is a governed recommendation engine that separates activity volume from workflow evidence, trust evidence, source coverage, and value-investigation readiness.</w:t>
       </w:r>
     </w:p>
     <w:p>
@@ -90,7 +90,7 @@
           <w:rFonts w:ascii="Arial" w:hAnsi="Arial"/>
           <w:sz w:val="21"/>
         </w:rPr>
-        <w:t>The internal data shows three distinct realities:</w:t>
+        <w:t>Top findings:</w:t>
       </w:r>
     </w:p>
     <w:p>
@@ -102,7 +102,7 @@
           <w:rFonts w:ascii="Arial" w:hAnsi="Arial"/>
           <w:sz w:val="20"/>
         </w:rPr>
-        <w:t>• AI is broadly present through high-volume assistive surfaces.</w:t>
+        <w:t>• AI is broadly present: 25,081 high-volume assistive work patterns show reach and surface coverage.</w:t>
       </w:r>
     </w:p>
     <w:p>
@@ -114,7 +114,7 @@
           <w:rFonts w:ascii="Arial" w:hAnsi="Arial"/>
           <w:sz w:val="20"/>
         </w:rPr>
-        <w:t>• A smaller but more valuable lane shows AI attached to workflow execution, post-friction continuation, and verification evidence.</w:t>
+        <w:t>• Workflow-grade evidence exists but is smaller: 2,025 aggregate patterns show search-to-agent movement, post-friction continuation, execution-linked workflow, or verification-attached workflow.</w:t>
       </w:r>
     </w:p>
     <w:p>
@@ -126,7 +126,31 @@
           <w:rFonts w:ascii="Arial" w:hAnsi="Arial"/>
           <w:sz w:val="20"/>
         </w:rPr>
-        <w:t>• The largest commercialization blocker is not lack of activity; it is missing or weak downstream evidence that would connect behavior to business outcomes.</w:t>
+        <w:t>• The strongest immediate value test is support friction: 1,333 aggregate patterns combine search-to-agent escalation with post-friction continuation.</w:t>
+      </w:r>
+    </w:p>
+    <w:p>
+      <w:pPr>
+        <w:ind w:left="259"/>
+      </w:pPr>
+      <w:r>
+        <w:rPr>
+          <w:rFonts w:ascii="Arial" w:hAnsi="Arial"/>
+          <w:sz w:val="20"/>
+        </w:rPr>
+        <w:t>• The biggest trust/product gap remains evidence quality: 37,959,260 aggregate product episodes sit in the public evidence gap.</w:t>
+      </w:r>
+    </w:p>
+    <w:p>
+      <w:pPr>
+        <w:ind w:left="259"/>
+      </w:pPr>
+      <w:r>
+        <w:rPr>
+          <w:rFonts w:ascii="Arial" w:hAnsi="Arial"/>
+          <w:sz w:val="20"/>
+        </w:rPr>
+        <w:t>• The current blocker is not telemetry volume; it is governed outcome evidence, attribution, and customer-owned assumptions.</w:t>
       </w:r>
     </w:p>
     <w:p>
@@ -138,7 +162,253 @@
           <w:rFonts w:ascii="Arial" w:hAnsi="Arial"/>
           <w:color w:val="061A44"/>
         </w:rPr>
-        <w:t>Fresh Data Run</w:t>
+        <w:t>Executive Outcomes And Strategies</w:t>
+      </w:r>
+    </w:p>
+    <w:p>
+      <w:r>
+        <w:rPr>
+          <w:rFonts w:ascii="Courier New" w:hAnsi="Courier New"/>
+          <w:sz w:val="15"/>
+        </w:rPr>
+        <w:t>| Outcome | What it means | Strategy |</w:t>
+      </w:r>
+    </w:p>
+    <w:p>
+      <w:r>
+        <w:rPr>
+          <w:rFonts w:ascii="Courier New" w:hAnsi="Courier New"/>
+          <w:sz w:val="15"/>
+        </w:rPr>
+        <w:t>| --- | --- | --- |</w:t>
+      </w:r>
+    </w:p>
+    <w:p>
+      <w:r>
+        <w:rPr>
+          <w:rFonts w:ascii="Courier New" w:hAnsi="Courier New"/>
+          <w:sz w:val="15"/>
+        </w:rPr>
+        <w:t>| Evidence layer is viable | Existing aggregate telemetry can produce a structured AI Work Evidence packet. | Sell the pilot as evidence readiness and recommendation routing, not as ROI proof. |</w:t>
+      </w:r>
+    </w:p>
+    <w:p>
+      <w:r>
+        <w:rPr>
+          <w:rFonts w:ascii="Courier New" w:hAnsi="Courier New"/>
+          <w:sz w:val="15"/>
+        </w:rPr>
+        <w:t>| Workflow evidence is differentiated | FluencyTracr can distinguish broad AI use from execution-linked, verification-linked, and recovery-like work paths. | Lead with workflow/service families rather than adoption volume. |</w:t>
+      </w:r>
+    </w:p>
+    <w:p>
+      <w:r>
+        <w:rPr>
+          <w:rFonts w:ascii="Courier New" w:hAnsi="Courier New"/>
+          <w:sz w:val="15"/>
+        </w:rPr>
+        <w:t>| Trust remains the proof-loop problem | Verification and continuation exist, but attribution gaps are still material. | Make trust-loop repair a strategic workstream before quality/risk claims. |</w:t>
+      </w:r>
+    </w:p>
+    <w:p>
+      <w:r>
+        <w:rPr>
+          <w:rFonts w:ascii="Courier New" w:hAnsi="Courier New"/>
+          <w:sz w:val="15"/>
+        </w:rPr>
+        <w:t>| Outcome data should be requested selectively | The recommendation engine can name the smallest next outcome data needed. | Ask for support, CRM, QA, or workflow metrics only when the observed pattern justifies it. |</w:t>
+      </w:r>
+    </w:p>
+    <w:p>
+      <w:r>
+        <w:rPr>
+          <w:rFonts w:ascii="Courier New" w:hAnsi="Courier New"/>
+          <w:sz w:val="15"/>
+        </w:rPr>
+        <w:t>| ROI remains blocked | No governed outcome join or assumption ledger is present in this packet. | Provide formulas for customer testing, not dollarized claims. |</w:t>
+      </w:r>
+    </w:p>
+    <w:p>
+      <w:pPr>
+        <w:pStyle w:val="Heading1"/>
+      </w:pPr>
+      <w:r>
+        <w:rPr>
+          <w:rFonts w:ascii="Arial" w:hAnsi="Arial"/>
+          <w:color w:val="061A44"/>
+        </w:rPr>
+        <w:t>Recommendation Engine Design</w:t>
+      </w:r>
+    </w:p>
+    <w:p>
+      <w:pPr>
+        <w:spacing w:after="120"/>
+      </w:pPr>
+      <w:r>
+        <w:rPr>
+          <w:rFonts w:ascii="Arial" w:hAnsi="Arial"/>
+          <w:sz w:val="21"/>
+        </w:rPr>
+        <w:t>Yes: this packet now contains a docs-only recommendation engine shape based on the FluencyTracr frameworks. It consumes aggregate AI Work Evidence, AI-service workflow families, Velocity x Depth context, behavioral primitives, trust/source coverage, and value-readiness zones. It emits recommended customer-owned outcome signals, formula families, readiness states, caveats, and blocked claims.</w:t>
+      </w:r>
+    </w:p>
+    <w:p>
+      <w:pPr>
+        <w:spacing w:after="120"/>
+      </w:pPr>
+      <w:r>
+        <w:rPr>
+          <w:rFonts w:ascii="Arial" w:hAnsi="Arial"/>
+          <w:sz w:val="21"/>
+        </w:rPr>
+        <w:t>It is not a runtime engine yet. It does not add APIs, schemas, canonical events, suppression reasons, scores, ROI calculation, causality claims, productivity claims, or people/team ranking.</w:t>
+      </w:r>
+    </w:p>
+    <w:p>
+      <w:r>
+        <w:rPr>
+          <w:rFonts w:ascii="Courier New" w:hAnsi="Courier New"/>
+          <w:sz w:val="15"/>
+        </w:rPr>
+        <w:t>| Recommendation | AI-service workflow family | Observed pattern | Outcome data to request | Value route | Current readiness |</w:t>
+      </w:r>
+    </w:p>
+    <w:p>
+      <w:r>
+        <w:rPr>
+          <w:rFonts w:ascii="Courier New" w:hAnsi="Courier New"/>
+          <w:sz w:val="15"/>
+        </w:rPr>
+        <w:t>| --- | --- | --- | --- | --- | --- |</w:t>
+      </w:r>
+    </w:p>
+    <w:p>
+      <w:r>
+        <w:rPr>
+          <w:rFonts w:ascii="Courier New" w:hAnsi="Courier New"/>
+          <w:sz w:val="15"/>
+        </w:rPr>
+        <w:t>| Support friction value test | Search-to-agent workflow | Search-to-agent escalation plus post-friction continuation | Resolution time, escalation rate, reopen rate, backlog movement, CSAT | Cost, experience, quality | Outcome evidence missing |</w:t>
+      </w:r>
+    </w:p>
+    <w:p>
+      <w:r>
+        <w:rPr>
+          <w:rFonts w:ascii="Courier New" w:hAnsi="Courier New"/>
+          <w:sz w:val="15"/>
+        </w:rPr>
+        <w:t>| Workflow execution capacity test | Agent or action execution workflow | Execution-linked workflow | Completed work volume, cycle time, backlog movement, stage progression | Capacity, cost, revenue | Outcome evidence missing |</w:t>
+      </w:r>
+    </w:p>
+    <w:p>
+      <w:r>
+        <w:rPr>
+          <w:rFonts w:ascii="Courier New" w:hAnsi="Courier New"/>
+          <w:sz w:val="15"/>
+        </w:rPr>
+        <w:t>| Verification quality and risk test | Verification or feedback-attached workflow | Verification-attached workflow | QA pass rate, defect rate, correction rate, reopen rate, approval coverage | Quality, risk | Trust attribution hold |</w:t>
+      </w:r>
+    </w:p>
+    <w:p>
+      <w:r>
+        <w:rPr>
+          <w:rFonts w:ascii="Courier New" w:hAnsi="Courier New"/>
+          <w:sz w:val="15"/>
+        </w:rPr>
+        <w:t>| Proof-loop repair agenda | Trust-evidence repair workflow | Trust evidence gap | Verification coverage, feedback-loop coverage, unresolved trust-gap rate | Risk, quality | Source coverage hold |</w:t>
+      </w:r>
+    </w:p>
+    <w:p>
+      <w:r>
+        <w:rPr>
+          <w:rFonts w:ascii="Courier New" w:hAnsi="Courier New"/>
+          <w:sz w:val="15"/>
+        </w:rPr>
+        <w:t>| Source-linkage repair | Source-linkage or boundary repair | Weak linkage context | Source coverage, join completeness, metadata completeness | Instrumentation | Source coverage hold |</w:t>
+      </w:r>
+    </w:p>
+    <w:p>
+      <w:pPr>
+        <w:pStyle w:val="Heading1"/>
+      </w:pPr>
+      <w:r>
+        <w:rPr>
+          <w:rFonts w:ascii="Arial" w:hAnsi="Arial"/>
+          <w:color w:val="061A44"/>
+        </w:rPr>
+        <w:t>Recommended Executive Strategy</w:t>
+      </w:r>
+    </w:p>
+    <w:p>
+      <w:pPr>
+        <w:spacing w:after="120"/>
+      </w:pPr>
+      <w:r>
+        <w:rPr>
+          <w:rFonts w:ascii="Arial" w:hAnsi="Arial"/>
+          <w:sz w:val="21"/>
+        </w:rPr>
+        <w:t>1. Start the client pilot with the AI Work Evidence packet, not an ROI promise.</w:t>
+      </w:r>
+    </w:p>
+    <w:p>
+      <w:pPr>
+        <w:spacing w:after="120"/>
+      </w:pPr>
+      <w:r>
+        <w:rPr>
+          <w:rFonts w:ascii="Arial" w:hAnsi="Arial"/>
+          <w:sz w:val="21"/>
+        </w:rPr>
+        <w:t>2. Use the recommendation engine to identify which outcome system should be connected next.</w:t>
+      </w:r>
+    </w:p>
+    <w:p>
+      <w:pPr>
+        <w:spacing w:after="120"/>
+      </w:pPr>
+      <w:r>
+        <w:rPr>
+          <w:rFonts w:ascii="Arial" w:hAnsi="Arial"/>
+          <w:sz w:val="21"/>
+        </w:rPr>
+        <w:t>3. Prioritize a support friction value test if the client has support outcomes available.</w:t>
+      </w:r>
+    </w:p>
+    <w:p>
+      <w:pPr>
+        <w:spacing w:after="120"/>
+      </w:pPr>
+      <w:r>
+        <w:rPr>
+          <w:rFonts w:ascii="Arial" w:hAnsi="Arial"/>
+          <w:sz w:val="21"/>
+        </w:rPr>
+        <w:t>4. Treat high-volume assistive use as reach, not value, until workflow completion evidence is attached.</w:t>
+      </w:r>
+    </w:p>
+    <w:p>
+      <w:pPr>
+        <w:spacing w:after="120"/>
+      </w:pPr>
+      <w:r>
+        <w:rPr>
+          <w:rFonts w:ascii="Arial" w:hAnsi="Arial"/>
+          <w:sz w:val="21"/>
+        </w:rPr>
+        <w:t>5. Keep trust evidence repair explicit before using quality, risk, or reliability language externally.</w:t>
+      </w:r>
+    </w:p>
+    <w:p>
+      <w:pPr>
+        <w:pStyle w:val="Heading1"/>
+      </w:pPr>
+      <w:r>
+        <w:rPr>
+          <w:rFonts w:ascii="Arial" w:hAnsi="Arial"/>
+          <w:color w:val="061A44"/>
+        </w:rPr>
+        <w:t>Appendix A: Fresh Data Run</w:t>
       </w:r>
     </w:p>
     <w:p>
@@ -255,7 +525,7 @@
           <w:rFonts w:ascii="Arial" w:hAnsi="Arial"/>
           <w:color w:val="061A44"/>
         </w:rPr>
-        <w:t>Motif Tier Distribution</w:t>
+        <w:t>AI Work Pattern Distribution</w:t>
       </w:r>
     </w:p>
     <w:p>
@@ -264,7 +534,7 @@
           <w:rFonts w:ascii="Courier New" w:hAnsi="Courier New"/>
           <w:sz w:val="15"/>
         </w:rPr>
-        <w:t>| Tier | Aggregate motifs | Share | Interpretation |</w:t>
+        <w:t>| AI-service workflow family | Pattern tier | Aggregate AI work patterns | Share | Interpretation |</w:t>
       </w:r>
     </w:p>
     <w:p>
@@ -273,7 +543,7 @@
           <w:rFonts w:ascii="Courier New" w:hAnsi="Courier New"/>
           <w:sz w:val="15"/>
         </w:rPr>
-        <w:t>| --- | ---: | ---: | --- |</w:t>
+        <w:t>| --- | --- | ---: | ---: | --- |</w:t>
       </w:r>
     </w:p>
     <w:p>
@@ -282,7 +552,7 @@
           <w:rFonts w:ascii="Courier New" w:hAnsi="Courier New"/>
           <w:sz w:val="15"/>
         </w:rPr>
-        <w:t>| High Volume Assistive Surface | 25,081 | 90.9% | Reach and surface coverage; weak workflow evidence by itself. |</w:t>
+        <w:t>| Assistive search or answer surface | High Volume Assistive Surface | 25,081 | 90.9% | Reach and surface coverage; weak workflow evidence by itself. |</w:t>
       </w:r>
     </w:p>
     <w:p>
@@ -291,7 +561,7 @@
           <w:rFonts w:ascii="Courier New" w:hAnsi="Courier New"/>
           <w:sz w:val="15"/>
         </w:rPr>
-        <w:t>| Post Friction Continuation | 891 | 3.2% | Recovery-like evidence: work continues after friction without claiming intent. |</w:t>
+        <w:t>| Search-to-agent workflow | Post Friction Continuation | 891 | 3.2% | Recovery-like evidence: work continues after friction without claiming intent. |</w:t>
       </w:r>
     </w:p>
     <w:p>
@@ -300,7 +570,7 @@
           <w:rFonts w:ascii="Courier New" w:hAnsi="Courier New"/>
           <w:sz w:val="15"/>
         </w:rPr>
-        <w:t>| Execution Linked Workflow | 478 | 1.7% | AI is attached to actual workflow execution. |</w:t>
+        <w:t>| Agent or action execution workflow | Execution Linked Workflow | 478 | 1.7% | AI is attached to actual workflow execution. |</w:t>
       </w:r>
     </w:p>
     <w:p>
@@ -309,7 +579,7 @@
           <w:rFonts w:ascii="Courier New" w:hAnsi="Courier New"/>
           <w:sz w:val="15"/>
         </w:rPr>
-        <w:t>| Search To Agent Escalation | 442 | 1.6% | Navigation from search into agent context; not outcome evidence yet. |</w:t>
+        <w:t>| Search-to-agent workflow | Search To Agent Escalation | 442 | 1.6% | Navigation from search into agent context; not outcome evidence yet. |</w:t>
       </w:r>
     </w:p>
     <w:p>
@@ -318,7 +588,7 @@
           <w:rFonts w:ascii="Courier New" w:hAnsi="Courier New"/>
           <w:sz w:val="15"/>
         </w:rPr>
-        <w:t>| Weak Linkage Context | 388 | 1.4% | Source-coverage caveat lane. |</w:t>
+        <w:t>| Source-linkage or boundary repair | Weak Linkage Context | 388 | 1.4% | Source-coverage caveat lane. |</w:t>
       </w:r>
     </w:p>
     <w:p>
@@ -327,7 +597,7 @@
           <w:rFonts w:ascii="Courier New" w:hAnsi="Courier New"/>
           <w:sz w:val="15"/>
         </w:rPr>
-        <w:t>| Verification Attached Workflow | 214 | 0.8% | Strongest trust-adjacent workflow lane. |</w:t>
+        <w:t>| Verification or feedback-attached workflow | Verification Attached Workflow | 214 | 0.8% | Strongest trust-adjacent workflow lane. |</w:t>
       </w:r>
     </w:p>
     <w:p>
@@ -336,7 +606,7 @@
           <w:rFonts w:ascii="Courier New" w:hAnsi="Courier New"/>
           <w:sz w:val="15"/>
         </w:rPr>
-        <w:t>| Other Linked Context | 96 | 0.3% | Residual linked context. |</w:t>
+        <w:t>| Residual linked context | Other Linked Context | 96 | 0.3% | Residual linked context. |</w:t>
       </w:r>
     </w:p>
     <w:p>
@@ -348,7 +618,7 @@
           <w:rFonts w:ascii="Arial" w:hAnsi="Arial"/>
           <w:color w:val="061A44"/>
         </w:rPr>
-        <w:t>Value Realization Readiness</w:t>
+        <w:t>Appendix B: Value Realization Readiness</w:t>
       </w:r>
     </w:p>
     <w:p>
@@ -423,7 +693,7 @@
           <w:rFonts w:ascii="Arial" w:hAnsi="Arial"/>
           <w:color w:val="061A44"/>
         </w:rPr>
-        <w:t>Trust And Source Coverage</w:t>
+        <w:t>Appendix C: Trust And Source Coverage</w:t>
       </w:r>
     </w:p>
     <w:p>
@@ -519,7 +789,7 @@
           <w:rFonts w:ascii="Arial" w:hAnsi="Arial"/>
           <w:color w:val="061A44"/>
         </w:rPr>
-        <w:t>Outcome And ROI Boundary</w:t>
+        <w:t>Appendix D: Outcome And ROI Boundary</w:t>
       </w:r>
     </w:p>
     <w:p>
@@ -615,7 +885,7 @@
           <w:rFonts w:ascii="Arial" w:hAnsi="Arial"/>
           <w:color w:val="061A44"/>
         </w:rPr>
-        <w:t>Pilot Decision Memo</w:t>
+        <w:t>Appendix E: Pilot Decision Memo</w:t>
       </w:r>
     </w:p>
     <w:p>
@@ -663,7 +933,7 @@
           <w:rFonts w:ascii="Arial" w:hAnsi="Arial"/>
           <w:sz w:val="21"/>
         </w:rPr>
-        <w:t>2. Show motif tiers so executives can distinguish reach, workflow execution, recovery-like continuation, verification, and weak-linkage gaps.</w:t>
+        <w:t>2. Show AI work pattern tiers so executives can distinguish reach, workflow execution, recovery-like continuation, verification, and weak-linkage gaps.</w:t>
       </w:r>
     </w:p>
     <w:p>
@@ -723,7 +993,7 @@
           <w:rFonts w:ascii="Arial" w:hAnsi="Arial"/>
           <w:color w:val="061A44"/>
         </w:rPr>
-        <w:t>Glossary</w:t>
+        <w:t>Appendix F: Glossary</w:t>
       </w:r>
     </w:p>
     <w:p>
@@ -891,7 +1161,7 @@
           <w:rFonts w:ascii="Arial" w:hAnsi="Arial"/>
           <w:sz w:val="20"/>
         </w:rPr>
-        <w:t>• **Motif tier:** A plain-language bucket that separates raw activity from stronger workflow, verification, or source-coverage evidence.</w:t>
+        <w:t>• **AI work pattern tier:** A plain-language bucket that separates raw AI activity from stronger workflow, verification, or source-coverage evidence.</w:t>
       </w:r>
     </w:p>
     <w:p>

</xml_diff>